<commit_message>
Opschonen: MediaPipe-backend en workflow_demo.py verwijderd, dode code opgeruimd, cache-migratiescript toegevoegd
</commit_message>
<xml_diff>
--- a/Jumpstart_web_interface_stepbystep_guide.docx
+++ b/Jumpstart_web_interface_stepbystep_guide.docx
@@ -2721,8 +2721,8 @@
 </file>
 
 <file path=customXml/item3.xml><?xml version="1.0" encoding="utf-8"?>
-<ct:contentTypeSchema xmlns:ct="http://schemas.microsoft.com/office/2006/metadata/contentType" xmlns:ma="http://schemas.microsoft.com/office/2006/metadata/properties/metaAttributes" ct:_="" ma:_="" ma:contentTypeName="Document" ma:contentTypeID="0x010100DD104D8021E12842B3FDA2E2BC23269B" ma:contentTypeVersion="12" ma:contentTypeDescription="Create a new document." ma:contentTypeScope="" ma:versionID="ef8d246cabf48d6ab61be7f4edd91108">
-  <xsd:schema xmlns:xsd="http://www.w3.org/2001/XMLSchema" xmlns:xs="http://www.w3.org/2001/XMLSchema" xmlns:p="http://schemas.microsoft.com/office/2006/metadata/properties" xmlns:ns2="e4d38030-f88a-44eb-b42f-b74a1425d531" xmlns:ns3="7d1df225-eba1-4d99-b445-0f660027db60" targetNamespace="http://schemas.microsoft.com/office/2006/metadata/properties" ma:root="true" ma:fieldsID="5a137e882e404a06fbbed71f581f32fe" ns2:_="" ns3:_="">
+<ct:contentTypeSchema xmlns:ct="http://schemas.microsoft.com/office/2006/metadata/contentType" xmlns:ma="http://schemas.microsoft.com/office/2006/metadata/properties/metaAttributes" ct:_="" ma:_="" ma:contentTypeName="Document" ma:contentTypeID="0x010100DD104D8021E12842B3FDA2E2BC23269B" ma:contentTypeVersion="12" ma:contentTypeDescription="Een nieuw document maken." ma:contentTypeScope="" ma:versionID="2a877b29bed09b8ce7ca26476aa712ea">
+  <xsd:schema xmlns:xsd="http://www.w3.org/2001/XMLSchema" xmlns:xs="http://www.w3.org/2001/XMLSchema" xmlns:p="http://schemas.microsoft.com/office/2006/metadata/properties" xmlns:ns2="e4d38030-f88a-44eb-b42f-b74a1425d531" xmlns:ns3="7d1df225-eba1-4d99-b445-0f660027db60" targetNamespace="http://schemas.microsoft.com/office/2006/metadata/properties" ma:root="true" ma:fieldsID="94423791ec5d8499b062f0479ec838f8" ns2:_="" ns3:_="">
     <xsd:import namespace="e4d38030-f88a-44eb-b42f-b74a1425d531"/>
     <xsd:import namespace="7d1df225-eba1-4d99-b445-0f660027db60"/>
     <xsd:element name="properties">
@@ -2787,7 +2787,7 @@
         <xsd:restriction base="dms:Text"/>
       </xsd:simpleType>
     </xsd:element>
-    <xsd:element name="lcf76f155ced4ddcb4097134ff3c332f" ma:index="16" nillable="true" ma:taxonomy="true" ma:internalName="lcf76f155ced4ddcb4097134ff3c332f" ma:taxonomyFieldName="MediaServiceImageTags" ma:displayName="Image Tags" ma:readOnly="false" ma:fieldId="{5cf76f15-5ced-4ddc-b409-7134ff3c332f}" ma:taxonomyMulti="true" ma:sspId="135eabb5-a18a-4215-84c6-3aa8d4454c81" ma:termSetId="09814cd3-568e-fe90-9814-8d621ff8fb84" ma:anchorId="fba54fb3-c3e1-fe81-a776-ca4b69148c4d" ma:open="true" ma:isKeyword="false">
+    <xsd:element name="lcf76f155ced4ddcb4097134ff3c332f" ma:index="16" nillable="true" ma:taxonomy="true" ma:internalName="lcf76f155ced4ddcb4097134ff3c332f" ma:taxonomyFieldName="MediaServiceImageTags" ma:displayName="Afbeeldingtags" ma:readOnly="false" ma:fieldId="{5cf76f15-5ced-4ddc-b409-7134ff3c332f}" ma:taxonomyMulti="true" ma:sspId="135eabb5-a18a-4215-84c6-3aa8d4454c81" ma:termSetId="09814cd3-568e-fe90-9814-8d621ff8fb84" ma:anchorId="fba54fb3-c3e1-fe81-a776-ca4b69148c4d" ma:open="true" ma:isKeyword="false">
       <xsd:complexType>
         <xsd:sequence>
           <xsd:element ref="pc:Terms" minOccurs="0" maxOccurs="1"/>
@@ -2831,8 +2831,8 @@
         <xsd:element ref="dc:creator" minOccurs="0" maxOccurs="1"/>
         <xsd:element ref="dcterms:created" minOccurs="0" maxOccurs="1"/>
         <xsd:element ref="dc:identifier" minOccurs="0" maxOccurs="1"/>
-        <xsd:element name="contentType" minOccurs="0" maxOccurs="1" type="xsd:string" ma:index="0" ma:displayName="Content Type"/>
-        <xsd:element ref="dc:title" minOccurs="0" maxOccurs="1" ma:index="4" ma:displayName="Title"/>
+        <xsd:element name="contentType" minOccurs="0" maxOccurs="1" type="xsd:string" ma:index="0" ma:displayName="Inhoudstype"/>
+        <xsd:element ref="dc:title" minOccurs="0" maxOccurs="1" ma:index="4" ma:displayName="Titel"/>
         <xsd:element ref="dc:subject" minOccurs="0" maxOccurs="1"/>
         <xsd:element ref="dc:description" minOccurs="0" maxOccurs="1"/>
         <xsd:element name="keywords" minOccurs="0" maxOccurs="1" type="xsd:string"/>
@@ -2941,5 +2941,5 @@
 </file>
 
 <file path=customXml/itemProps3.xml><?xml version="1.0" encoding="utf-8"?>
-<ds:datastoreItem xmlns:ds="http://schemas.openxmlformats.org/officeDocument/2006/customXml" ds:itemID="{651151A2-10BC-48A4-98DD-E44848ACFD1D}"/>
+<ds:datastoreItem xmlns:ds="http://schemas.openxmlformats.org/officeDocument/2006/customXml" ds:itemID="{93B1E2B9-4C50-4E29-977D-54BB7DA91CE9}"/>
 </file>
</xml_diff>